<commit_message>
Privacidad por propiedad (plan 4.2) e incidente I-11
- evaluacion/privacidad_propiedad.py: intenta reconstruir conteos de 1 a 9 desde
  lo publicado (tasa x tamaño entre tablas, O/E x esperado, complementos en las
  tablas por subgrupo) y busca valores de filas suprimidas en pruebas y docs.
  Canarios en tests/test_privacidad_propiedad.py.
- Sobre las salidas reales encontró 13 conteos nacionales reconstruibles por
  complemento en las tablas por subgrupo (F5 2023 y 2024; F6). Se declaran como
  I-11, sin publicar los conteos; la decisión de publicación queda pendiente.
- Puertas P7 y G7: fallan ante cualquier hallazgo nuevo.
- Constancia y documento de gobernanza: incidentes I-01 a I-11.

Co-Authored-By: Claude Opus 5.5 <noreply@anthropic.com>
Claude-Session: https://claude.ai/code/session_0192aVCC8aocJbeAsVJ1Mter
</commit_message>
<xml_diff>
--- a/docs/gobernanza/Etapa0_Gobernanza_para_firma.docx
+++ b/docs/gobernanza/Etapa0_Gobernanza_para_firma.docx
@@ -990,7 +990,7 @@
                 <w:sz w:val="19"/>
                 <w:szCs w:val="19"/>
               </w:rPr>
-              <w:t xml:space="preserve">Registro completo, I-01 a I-10, con evidencia, impacto y medida (Anexo C)</w:t>
+              <w:t xml:space="preserve">Registro completo, I-01 a I-11, con evidencia, impacto y medida (Anexo C)</w:t>
             </w:r>
           </w:p>
         </w:tc>
@@ -1021,7 +1021,7 @@
                 <w:sz w:val="19"/>
                 <w:szCs w:val="19"/>
               </w:rPr>
-              <w:t xml:space="preserve">Que el profesor lo conozca (Parte B); decidir I-09</w:t>
+              <w:t xml:space="preserve">Que el profesor lo conozca (Parte B); decidir I-09 e I-11</w:t>
             </w:r>
           </w:p>
         </w:tc>
@@ -1481,7 +1481,7 @@
         <w:t xml:space="preserve">☐  </w:t>
       </w:r>
       <w:r>
-        <w:t xml:space="preserve">Conozco el registro de incidentes I-01 a I-10 (Anexo C). Entre ellos está la evaluación de un prototipo anterior en 2024, el 27-09-2026 (I-01).</w:t>
+        <w:t xml:space="preserve">Conozco el registro de incidentes I-01 a I-11 (Anexo C). Entre ellos está la evaluación de un prototipo anterior en 2024, el 27-09-2026 (I-01).</w:t>
       </w:r>
     </w:p>
     <w:p>
@@ -8516,6 +8516,166 @@
                 <w:szCs w:val="19"/>
               </w:rPr>
               <w:t xml:space="preserve">No cambia cifras; la constancia es una ratificación posterior</w:t>
+            </w:r>
+          </w:p>
+        </w:tc>
+      </w:tr>
+      <w:tr>
+        <w:trPr>
+          <w:cantSplit/>
+        </w:trPr>
+        <w:tc>
+          <w:tcPr>
+            <w:tcW w:type="dxa" w:w="649"/>
+            <w:tcBorders>
+              <w:top w:val="single" w:color="D9D9D9" w:sz="4"/>
+              <w:left w:val="single" w:color="D9D9D9" w:sz="4"/>
+              <w:bottom w:val="single" w:color="D9D9D9" w:sz="4"/>
+              <w:right w:val="single" w:color="D9D9D9" w:sz="4"/>
+            </w:tcBorders>
+            <w:shd w:fill="F7F7F7" w:color="auto" w:val="clear"/>
+            <w:tcMar>
+              <w:top w:type="dxa" w:w="70"/>
+              <w:left w:type="dxa" w:w="110"/>
+              <w:bottom w:type="dxa" w:w="70"/>
+              <w:right w:type="dxa" w:w="110"/>
+            </w:tcMar>
+            <w:vAlign w:val="top"/>
+          </w:tcPr>
+          <w:p>
+            <w:pPr>
+              <w:spacing w:after="40" w:line="252"/>
+            </w:pPr>
+            <w:r>
+              <w:rPr>
+                <w:sz w:val="19"/>
+                <w:szCs w:val="19"/>
+              </w:rPr>
+              <w:t xml:space="preserve">I-11</w:t>
+            </w:r>
+          </w:p>
+        </w:tc>
+        <w:tc>
+          <w:tcPr>
+            <w:tcW w:type="dxa" w:w="1112"/>
+            <w:tcBorders>
+              <w:top w:val="single" w:color="D9D9D9" w:sz="4"/>
+              <w:left w:val="single" w:color="D9D9D9" w:sz="4"/>
+              <w:bottom w:val="single" w:color="D9D9D9" w:sz="4"/>
+              <w:right w:val="single" w:color="D9D9D9" w:sz="4"/>
+            </w:tcBorders>
+            <w:shd w:fill="F7F7F7" w:color="auto" w:val="clear"/>
+            <w:tcMar>
+              <w:top w:type="dxa" w:w="70"/>
+              <w:left w:type="dxa" w:w="110"/>
+              <w:bottom w:type="dxa" w:w="70"/>
+              <w:right w:type="dxa" w:w="110"/>
+            </w:tcMar>
+            <w:vAlign w:val="top"/>
+          </w:tcPr>
+          <w:p>
+            <w:pPr>
+              <w:spacing w:after="40" w:line="252"/>
+            </w:pPr>
+            <w:r>
+              <w:rPr>
+                <w:sz w:val="19"/>
+                <w:szCs w:val="19"/>
+              </w:rPr>
+              <w:t xml:space="preserve">22-10</w:t>
+            </w:r>
+          </w:p>
+        </w:tc>
+        <w:tc>
+          <w:tcPr>
+            <w:tcW w:type="dxa" w:w="3892"/>
+            <w:tcBorders>
+              <w:top w:val="single" w:color="D9D9D9" w:sz="4"/>
+              <w:left w:val="single" w:color="D9D9D9" w:sz="4"/>
+              <w:bottom w:val="single" w:color="D9D9D9" w:sz="4"/>
+              <w:right w:val="single" w:color="D9D9D9" w:sz="4"/>
+            </w:tcBorders>
+            <w:shd w:fill="F7F7F7" w:color="auto" w:val="clear"/>
+            <w:tcMar>
+              <w:top w:type="dxa" w:w="70"/>
+              <w:left w:type="dxa" w:w="110"/>
+              <w:bottom w:type="dxa" w:w="70"/>
+              <w:right w:type="dxa" w:w="110"/>
+            </w:tcMar>
+            <w:vAlign w:val="top"/>
+          </w:tcPr>
+          <w:p>
+            <w:pPr>
+              <w:spacing w:after="40" w:line="252"/>
+            </w:pPr>
+            <w:r>
+              <w:rPr>
+                <w:sz w:val="19"/>
+                <w:szCs w:val="19"/>
+              </w:rPr>
+              <w:t xml:space="preserve">Conteos nacionales de 1 a 9 reconstruibles por complemento en las tablas por subgrupo de pacientes (F5 2023 y 2024, F6); no son por hospital</w:t>
+            </w:r>
+          </w:p>
+        </w:tc>
+        <w:tc>
+          <w:tcPr>
+            <w:tcW w:type="dxa" w:w="1668"/>
+            <w:tcBorders>
+              <w:top w:val="single" w:color="D9D9D9" w:sz="4"/>
+              <w:left w:val="single" w:color="D9D9D9" w:sz="4"/>
+              <w:bottom w:val="single" w:color="D9D9D9" w:sz="4"/>
+              <w:right w:val="single" w:color="D9D9D9" w:sz="4"/>
+            </w:tcBorders>
+            <w:shd w:fill="F7F7F7" w:color="auto" w:val="clear"/>
+            <w:tcMar>
+              <w:top w:type="dxa" w:w="70"/>
+              <w:left w:type="dxa" w:w="110"/>
+              <w:bottom w:type="dxa" w:w="70"/>
+              <w:right w:type="dxa" w:w="110"/>
+            </w:tcMar>
+            <w:vAlign w:val="top"/>
+          </w:tcPr>
+          <w:p>
+            <w:pPr>
+              <w:spacing w:after="40" w:line="252"/>
+            </w:pPr>
+            <w:r>
+              <w:rPr>
+                <w:sz w:val="19"/>
+                <w:szCs w:val="19"/>
+              </w:rPr>
+              <w:t xml:space="preserve">Después</w:t>
+            </w:r>
+          </w:p>
+        </w:tc>
+        <w:tc>
+          <w:tcPr>
+            <w:tcW w:type="dxa" w:w="2039"/>
+            <w:tcBorders>
+              <w:top w:val="single" w:color="D9D9D9" w:sz="4"/>
+              <w:left w:val="single" w:color="D9D9D9" w:sz="4"/>
+              <w:bottom w:val="single" w:color="D9D9D9" w:sz="4"/>
+              <w:right w:val="single" w:color="D9D9D9" w:sz="4"/>
+            </w:tcBorders>
+            <w:shd w:fill="F7F7F7" w:color="auto" w:val="clear"/>
+            <w:tcMar>
+              <w:top w:type="dxa" w:w="70"/>
+              <w:left w:type="dxa" w:w="110"/>
+              <w:bottom w:type="dxa" w:w="70"/>
+              <w:right w:type="dxa" w:w="110"/>
+            </w:tcMar>
+            <w:vAlign w:val="top"/>
+          </w:tcPr>
+          <w:p>
+            <w:pPr>
+              <w:spacing w:after="40" w:line="252"/>
+            </w:pPr>
+            <w:r>
+              <w:rPr>
+                <w:sz w:val="19"/>
+                <w:szCs w:val="19"/>
+              </w:rPr>
+              <w:t xml:space="preserve">Decisión pendiente: supresión secundaria o declararlo</w:t>
             </w:r>
           </w:p>
         </w:tc>

</xml_diff>